<commit_message>
v1.6.0: 附录B补充再程放疗文献依据(Garg 2004/Jiang 2016/Fortson 2012)+参考文献26-28
</commit_message>
<xml_diff>
--- a/瘢痕疙瘩放疗常规/九院瘢痕疙瘩术后放疗常规_v1.0_值班操作指引.docx
+++ b/瘢痕疙瘩放疗常规/九院瘢痕疙瘩术后放疗常规_v1.0_值班操作指引.docx
@@ -9825,6 +9825,128 @@
         <w:t xml:space="preserve">41015665），但长期随访真实复发率约39%——随访不足会低估复发。</w:t>
       </w:r>
     </w:p>
+    <w:p>
+      <w:pPr>
+        <w:pStyle w:val="BodyText"/>
+      </w:pPr>
+      <w:r>
+        <w:rPr>
+          <w:rFonts w:hint="eastAsia"/>
+          <w:b/>
+          <w:bCs/>
+        </w:rPr>
+        <w:t xml:space="preserve">再程放疗（放疗后复发再切除后再程照射）的文献依据（资料性）</w:t>
+      </w:r>
+      <w:r>
+        <w:rPr>
+          <w:rFonts w:hint="eastAsia"/>
+        </w:rPr>
+        <w:t xml:space="preserve">：①</w:t>
+      </w:r>
+      <w:r>
+        <w:rPr>
+          <w:b/>
+          <w:bCs/>
+        </w:rPr>
+        <w:t xml:space="preserve">Garg 2004</w:t>
+      </w:r>
+      <w:r>
+        <w:rPr>
+          <w:rFonts w:hint="eastAsia"/>
+        </w:rPr>
+        <w:t xml:space="preserve">（PMID</w:t>
+      </w:r>
+      <w:r>
+        <w:t xml:space="preserve"> </w:t>
+      </w:r>
+      <w:r>
+        <w:rPr>
+          <w:rFonts w:hint="eastAsia"/>
+        </w:rPr>
+        <w:t xml:space="preserve">15542171）——外照射后复发的17个病灶，再切除后HDR</w:t>
+      </w:r>
+      <w:r>
+        <w:t xml:space="preserve"> 15 </w:t>
+      </w:r>
+      <w:r>
+        <w:rPr>
+          <w:rFonts w:hint="eastAsia"/>
+        </w:rPr>
+        <w:t xml:space="preserve">Gy/3次（术后连续3个工作日），88%（15/17）无复发；②</w:t>
+      </w:r>
+      <w:r>
+        <w:rPr>
+          <w:b/>
+          <w:bCs/>
+        </w:rPr>
+        <w:t xml:space="preserve">Jiang 2016</w:t>
+      </w:r>
+      <w:r>
+        <w:rPr>
+          <w:rFonts w:hint="eastAsia"/>
+        </w:rPr>
+        <w:t xml:space="preserve">（PMID</w:t>
+      </w:r>
+      <w:r>
+        <w:t xml:space="preserve"> </w:t>
+      </w:r>
+      <w:r>
+        <w:rPr>
+          <w:rFonts w:hint="eastAsia"/>
+        </w:rPr>
+        <w:t xml:space="preserve">26867882）——治疗抵抗性（含放疗后复发）瘢痕疙瘩组织间插植HDR前瞻研究，可行性与早期结果良好；③</w:t>
+      </w:r>
+      <w:r>
+        <w:rPr>
+          <w:b/>
+          <w:bCs/>
+        </w:rPr>
+        <w:t xml:space="preserve">Fortson 2012</w:t>
+      </w:r>
+      <w:r>
+        <w:rPr>
+          <w:rFonts w:hint="eastAsia"/>
+        </w:rPr>
+        <w:t xml:space="preserve">（PMID</w:t>
+      </w:r>
+      <w:r>
+        <w:t xml:space="preserve"> </w:t>
+      </w:r>
+      <w:r>
+        <w:rPr>
+          <w:rFonts w:hint="eastAsia"/>
+        </w:rPr>
+        <w:t xml:space="preserve">22829034）——儿童期首次放疗、成年后再程的个案，再程20个月后同区涎腺黏液表皮样癌——</w:t>
+      </w:r>
+      <w:r>
+        <w:rPr>
+          <w:rFonts w:hint="eastAsia"/>
+          <w:b/>
+          <w:bCs/>
+        </w:rPr>
+        <w:t xml:space="preserve">再程放疗须充分知情（晚期毒性、理论致癌风险累积）</w:t>
+      </w:r>
+      <w:r>
+        <w:rPr>
+          <w:rFonts w:hint="eastAsia"/>
+        </w:rPr>
+        <w:t xml:space="preserve">。再程放疗</w:t>
+      </w:r>
+      <w:r>
+        <w:rPr>
+          <w:rFonts w:hint="eastAsia"/>
+          <w:b/>
+          <w:bCs/>
+        </w:rPr>
+        <w:t xml:space="preserve">无RCT、无专门共识</w:t>
+      </w:r>
+      <w:r>
+        <w:rPr>
+          <w:rFonts w:hint="eastAsia"/>
+        </w:rPr>
+        <w:t xml:space="preserve">，均属专家意见级：首选与首次不同的技术（外照射后复发→HDR）、间隔≥12个月、累积剂量（EQD2/BED）评估、科内会诊后实施。</w:t>
+      </w:r>
+    </w:p>
     <w:bookmarkEnd w:id="43"/>
     <w:bookmarkStart w:id="49" w:name="附录c瘢痕评估量表详目"/>
     <w:p>
@@ -11364,6 +11486,42 @@
           <w:rFonts w:hint="eastAsia"/>
         </w:rPr>
         <w:t xml:space="preserve">38582626.（急性不良反应部分引用）</w:t>
+      </w:r>
+      <w:r>
+        <w:br/>
+      </w:r>
+      <w:r>
+        <w:t xml:space="preserve">26. Garg MK, et al. Adjuvant high dose rate brachytherapy (Ir-192) in the management of keloids which have recurred after surgical excision and external radiation. Radiother Oncol 2004. PMID </w:t>
+      </w:r>
+      <w:r>
+        <w:rPr>
+          <w:rFonts w:hint="eastAsia"/>
+        </w:rPr>
+        <w:t xml:space="preserve">15542171.（再程放疗）</w:t>
+      </w:r>
+      <w:r>
+        <w:br/>
+      </w:r>
+      <w:r>
+        <w:t xml:space="preserve">27. Jiang P, et al. Perioperative interstitial high-dose-rate brachytherapy for the treatment of recurrent keloids: feasibility and early results. Int J Radiat Oncol Biol Phys 2016. PMID </w:t>
+      </w:r>
+      <w:r>
+        <w:rPr>
+          <w:rFonts w:hint="eastAsia"/>
+        </w:rPr>
+        <w:t xml:space="preserve">26867882.（再程放疗）</w:t>
+      </w:r>
+      <w:r>
+        <w:br/>
+      </w:r>
+      <w:r>
+        <w:t xml:space="preserve">28. Fortson JK, et al. Atypical presentation of mucoepidermoid carcinoma after radiation therapy for the treatment of keloids. Ear Nose Throat J 2012. PMID </w:t>
+      </w:r>
+      <w:r>
+        <w:rPr>
+          <w:rFonts w:hint="eastAsia"/>
+        </w:rPr>
+        <w:t xml:space="preserve">22829034.（再程放疗致癌警示）</w:t>
       </w:r>
     </w:p>
     <w:p>

</xml_diff>